<commit_message>
Shorten ULTJ-to-GOTO note to one page of prose under a single title
Co-Authored-By: Claude Opus 5.5 <noreply@anthropic.com>
Claude-Session: https://claude.ai/code/session_01U5zaKN8eSrW2AdoJ1d5V8T
</commit_message>
<xml_diff>
--- a/Investment_Note_2026-10-02_ULTJ_to_GOTO.docx
+++ b/Investment_Note_2026-10-02_ULTJ_to_GOTO.docx
@@ -7,108 +7,51 @@
         <w:pStyle w:val="Title"/>
       </w:pPr>
       <w:r>
-        <w:t>Portfolio Note: Exit ULTJ, Buy GOTO</w:t>
+        <w:t>Exit ULTJ, Buy GOTO (2 October 2026)</w:t>
       </w:r>
     </w:p>
     <w:p>
       <w:r>
-        <w:t>2 October 2026 · First draft</w:t>
+        <w:t>We are selling our full ULTJ holding and moving the proceeds into GOTO. ULTJ still has events ahead, but its future after the Frisian Flag deal is unclear. GOTO has fallen for technical reasons, and the business itself keeps improving.</w:t>
       </w:r>
     </w:p>
     <w:p>
       <w:r>
-        <w:t>Action. We are selling our full holding in ULTJ and moving the proceeds into GOTO. ULTJ has upcoming catalysts, but what the company will look like after the Frisian Flag deal is still unclear. GOTO has fallen for technical reasons that have little to do with how the business is performing, and we think the market is now mispricing it.</w:t>
-      </w:r>
-    </w:p>
-    <w:p>
-      <w:pPr>
-        <w:pStyle w:val="Heading1"/>
-      </w:pPr>
-      <w:r>
-        <w:t>1. Why we are selling ULTJ</w:t>
+        <w:t>ULTJ will hold a shareholder meeting on 27 October. Shareholders will vote on a rights issue of up to 7.87bn shares at Rp2,150, which will fund the ~Rp14.6tn purchase of Frisian Flag Indonesia, and on an additional cash dividend. FrieslandCampina would become the controlling shareholder and must then make a tender offer to other shareholders at no less than Rp2,150, targeted for early 2027. A higher tender offer price and the extra dividend are both possible, but neither is decided, and the share price already rose close to Rp2,150 when the deal was announced. After the deal ULTJ will have a much larger share count, a much larger business and a new owner whose plans are not yet known. We would rather take our gains now than tie up capital until 2027 for a small and uncertain gain.</w:t>
       </w:r>
     </w:p>
     <w:p>
       <w:r>
-        <w:t>ULTJ will hold an extraordinary shareholder meeting on 27 October 2026. Shareholders will vote on a rights issue of up to 7.87bn new shares at Rp2,150, which will fund the ~Rp14.6tn purchase of 100% of Frisian Flag Indonesia. They will also vote on an additional final cash dividend from retained earnings and on board changes. After the deal, FrieslandCampina would control about 29–31% of ULTJ and must make a mandatory tender offer (MTO) to other shareholders. Under the rules, the MTO price cannot be lower than Rp2,150. The tender offer is targeted for early 2027.</w:t>
+        <w:t>GOTO's fall is mostly forced selling. From mid-May the stock was stuck at Rp50, the exchange's minimum price, and became illiquid. MSCI therefore removed it from its index on 31 August, and FTSE has also removed it. Index funds must sell whatever the price, and Mirae estimated outflows of up to Rp1tn. With no buyers allowed below Rp50, these orders built up in a queue. When the exchange lowered the minimum price to Rp1 on 28 September, the queued selling went through and the stock fell to Rp28. Some investors who bought with borrowed money may also have been forced to sell (margin calls). Management describes the fall as technical, not a reflection of the business.</w:t>
       </w:r>
     </w:p>
     <w:p>
       <w:r>
-        <w:t>We see two possible positives for current holders: the extra dividend, and the chance that the MTO price is set above Rp2,150. Neither is certain yet. The size of the dividend has not been fixed, and Rp2,150 is a floor, not a promised price. The share price also moved close to that floor as soon as the deal was announced (Rp2,060 on 18 September), so most of the upside is already in the price.</w:t>
+        <w:t>The business tells a different story. In 2Q26 net revenue grew 31% to Rp5.7tn, adjusted EBITDA rose 137% to more than Rp1tn, and net profit was Rp252bn, the second profitable quarter in a row. Management expects operating profit, which excludes currency movements and changes in the value of its Tokopedia stake, to stay positive, so the profit comes from the business itself. GOTO held Rp23.5tn of cash in June. At Rp28 the company is worth about Rp32tn, so cash covers roughly 73% of its market value before borrowings.</w:t>
       </w:r>
     </w:p>
     <w:p>
       <w:r>
-        <w:t>The bigger issue is what happens after the deal. ULTJ will issue a large block of new shares, take on a much larger business and get a new controlling shareholder. The new owner's plans for strategy, dividend policy and the listing itself are not yet clear. Holding the stock until an MTO in early 2027 ties up capital for several months for a limited and uncertain gain. We prefer to take our profit now.</w:t>
-      </w:r>
-    </w:p>
-    <w:p>
-      <w:pPr>
-        <w:pStyle w:val="Heading1"/>
-      </w:pPr>
-      <w:r>
-        <w:t>2. Why we are buying GOTO</w:t>
+        <w:t>Concern over driver regulation is understandable but, in our view, not material. The new 8% commission cap applies to two-wheel rides (GoRide), which are only about 7% of group net revenue. The company has already cut its guidance for this by about Rp300bn, and it earns most of its profit elsewhere: payments and lending now earn more than Gojek, alongside food and parcel delivery and merchant services.</w:t>
       </w:r>
     </w:p>
     <w:p>
       <w:r>
-        <w:t>The fall in the share price is mostly technical. From mid-May, GOTO was stuck at Rp50, the exchange's minimum price, and very few shares changed hands. Because the stock had become illiquid, MSCI announced on 13 August that it would remove GOTO from its index, effective 31 August. FTSE has also removed the stock. Index-tracking funds must sell when a stock leaves the index, whatever the price. Mirae estimated outflows of up to Rp1tn. With no buyers allowed below Rp50, these sell orders could not be filled and built up in a queue. On 28 September the exchange lowered the minimum price to Rp1, and the queued selling went through. The stock fell to Rp28 by 1 October. Some of the selling may also have come from investors who bought with borrowed money and had to sell when the price dropped (margin calls). Management has said the price moves reflect technical factors and index changes rather than the business.</w:t>
-      </w:r>
-    </w:p>
-    <w:p>
-      <w:r>
-        <w:t>The business keeps improving. In 2Q26, net revenue rose 31% to Rp5.7tn, and adjusted EBITDA rose 137% to more than Rp1tn. Net profit was Rp252bn, the second profitable quarter in a row. Management says operating profit, which excludes currency movements and changes in the value of its Tokopedia stake, should stay positive. This means the profit comes from the business itself, not from one-off accounting gains. The payments and lending business (Fintech) is now the main source of profit. Its adjusted EBITDA grew 447% to Rp481bn and overtook On-Demand Services (Gojek) for the first time.</w:t>
-      </w:r>
-    </w:p>
-    <w:p>
-      <w:r>
-        <w:t>The valuation is low. GOTO held Rp23.5tn of cash at the end of June. At Rp28, the whole company is worth about Rp32tn, so cash alone covers roughly 73% of the market value. Borrowings, and any cash used to fund GoPay Later loans, still need to be deducted to get a precise net figure. Even so, investors are paying very little for a business that is growing and profitable.</w:t>
-      </w:r>
-    </w:p>
-    <w:p>
-      <w:r>
-        <w:t>Driver regulation is manageable. From 1 July 2026, the government capped the commission on two-wheel rides (GoRide) at 8%. GoRide is only about 7% of group net revenue. The company has already cut its full-year On-Demand EBITDA guidance by about Rp300bn to reflect this, so the market already knows the cost. GOTO also has other ways to earn, including payments, lending, food and parcel delivery, and services for merchants.</w:t>
-      </w:r>
-    </w:p>
-    <w:p>
-      <w:pPr>
-        <w:pStyle w:val="Heading1"/>
-      </w:pPr>
-      <w:r>
-        <w:t>3. Key risks</w:t>
-      </w:r>
-    </w:p>
-    <w:p>
-      <w:r>
-        <w:t>Regulation may spread to GoCar, GoFood or GoSend, which are much larger than GoRide. Ministers met in August to discuss food delivery. Full-year guidance also implies weaker profit in the second half. Selling pressure may continue for some time, and with a Rp1 tick each price step is now 3–4% of the share price, so the stock will be volatile. The paylater business faces tighter OJK rules and a new competitor in Grab-backed Atome.</w:t>
-      </w:r>
-    </w:p>
-    <w:p>
-      <w:pPr>
-        <w:pStyle w:val="Heading1"/>
-      </w:pPr>
-      <w:r>
-        <w:t>Conclusion</w:t>
-      </w:r>
-    </w:p>
-    <w:p>
-      <w:r>
-        <w:t>ULTJ's remaining upside is small and depends on decisions that have not been made yet. GOTO's fall is driven mainly by forced, price-insensitive selling, while the business is profitable and grows every quarter. We think the selling has pushed GOTO well below its fair value, and we are reallocating from ULTJ to GOTO.</w:t>
+        <w:t>The main risks are that regulation extends to GoCar or GoFood, a softer second half, and continued volatility while the remaining sellers exit. We think forced, price-insensitive selling has pushed GOTO well below its fair value and that this is a good entry point.</w:t>
       </w:r>
     </w:p>
     <w:p>
       <w:r>
         <w:rPr>
           <w:i/>
-          <w:sz w:val="18"/>
+          <w:sz w:val="17"/>
         </w:rPr>
-        <w:t>Sources: ULTJ disclosures via Bisnis Indonesia, IDX Channel, CNBC Indonesia and Kontan; GoTo 2Q26 results and earnings call; MSCI via Reuters; Mirae Asset; Kompas; Katadata; IDN Financials. Prices as of 2 October 2026. Not investment advice.</w:t>
+        <w:t>Sources: ULTJ disclosures via Bisnis Indonesia and CNBC Indonesia; GoTo 2Q26 results and earnings call; MSCI via Reuters; Mirae Asset; Kompas; Katadata. Prices as of 2 October 2026. Not investment advice.</w:t>
       </w:r>
     </w:p>
     <w:sectPr>
       <w:pgSz w:w="12240" w:h="15840"/>
-      <w:pgMar w:top="1440" w:right="1800" w:bottom="1440" w:left="1800" w:header="720" w:footer="720" w:gutter="0"/>
+      <w:pgMar w:top="1134" w:right="1247" w:bottom="1134" w:left="1247" w:header="720" w:footer="720" w:gutter="0"/>
       <w:cols w:space="720"/>
       <w:docGrid w:linePitch="360"/>
     </w:sectPr>
@@ -479,6 +422,9 @@
     <w:name w:val="Normal"/>
     <w:qFormat/>
     <w:rsid w:val="00FC693F"/>
+    <w:pPr>
+      <w:spacing w:after="120"/>
+    </w:pPr>
     <w:rPr>
       <w:rFonts w:ascii="Calibri" w:hAnsi="Calibri"/>
       <w:sz w:val="22"/>

</xml_diff>

<commit_message>
Condense ULTJ-to-GOTO note to four short paragraphs
Co-Authored-By: Claude Opus 5.5 <noreply@anthropic.com>
Claude-Session: https://claude.ai/code/session_01U5zaKN8eSrW2AdoJ1d5V8T
</commit_message>
<xml_diff>
--- a/Investment_Note_2026-10-02_ULTJ_to_GOTO.docx
+++ b/Investment_Note_2026-10-02_ULTJ_to_GOTO.docx
@@ -12,32 +12,22 @@
     </w:p>
     <w:p>
       <w:r>
-        <w:t>We are selling our full ULTJ holding and moving the proceeds into GOTO. ULTJ still has events ahead, but its future after the Frisian Flag deal is unclear. GOTO has fallen for technical reasons, and the business itself keeps improving.</w:t>
+        <w:t>We are selling our ULTJ holding and buying GOTO. ULTJ's shareholders will meet on 27 October to vote on a rights issue at Rp2,150 to buy Frisian Flag Indonesia and on an extra dividend. FrieslandCampina would then become the controller and make a tender offer at no less than Rp2,150 in early 2027. The dividend and any premium on the tender offer price are still undecided, the share price is already near Rp2,150, and the company's direction after the deal is unclear. We prefer to take our gains now.</w:t>
       </w:r>
     </w:p>
     <w:p>
       <w:r>
-        <w:t>ULTJ will hold a shareholder meeting on 27 October. Shareholders will vote on a rights issue of up to 7.87bn shares at Rp2,150, which will fund the ~Rp14.6tn purchase of Frisian Flag Indonesia, and on an additional cash dividend. FrieslandCampina would become the controlling shareholder and must then make a tender offer to other shareholders at no less than Rp2,150, targeted for early 2027. A higher tender offer price and the extra dividend are both possible, but neither is decided, and the share price already rose close to Rp2,150 when the deal was announced. After the deal ULTJ will have a much larger share count, a much larger business and a new owner whose plans are not yet known. We would rather take our gains now than tie up capital until 2027 for a small and uncertain gain.</w:t>
+        <w:t>GOTO's fall is mostly forced selling. The stock was stuck at the Rp50 minimum price from mid-May and became illiquid, so MSCI and FTSE removed it from their indices and index funds had to sell. Once the exchange cut the minimum price to Rp1 on 28 September, the queued selling went through and the stock fell to Rp28. Margin calls may have added to the pressure.</w:t>
       </w:r>
     </w:p>
     <w:p>
       <w:r>
-        <w:t>GOTO's fall is mostly forced selling. From mid-May the stock was stuck at Rp50, the exchange's minimum price, and became illiquid. MSCI therefore removed it from its index on 31 August, and FTSE has also removed it. Index funds must sell whatever the price, and Mirae estimated outflows of up to Rp1tn. With no buyers allowed below Rp50, these orders built up in a queue. When the exchange lowered the minimum price to Rp1 on 28 September, the queued selling went through and the stock fell to Rp28. Some investors who bought with borrowed money may also have been forced to sell (margin calls). Management describes the fall as technical, not a reflection of the business.</w:t>
+        <w:t>The business keeps improving. In 2Q26 net revenue grew 31% to Rp5.7tn and net profit was Rp252bn, the second profitable quarter in a row. Management expects operating profit, before currency and Tokopedia valuation effects, to stay positive. Cash of Rp23.5tn covers about 73% of the Rp32tn market value. The 8% commission cap on drivers affects GoRide, only about 7% of revenue, and the company earns most of its profit elsewhere.</w:t>
       </w:r>
     </w:p>
     <w:p>
       <w:r>
-        <w:t>The business tells a different story. In 2Q26 net revenue grew 31% to Rp5.7tn, adjusted EBITDA rose 137% to more than Rp1tn, and net profit was Rp252bn, the second profitable quarter in a row. Management expects operating profit, which excludes currency movements and changes in the value of its Tokopedia stake, to stay positive, so the profit comes from the business itself. GOTO held Rp23.5tn of cash in June. At Rp28 the company is worth about Rp32tn, so cash covers roughly 73% of its market value before borrowings.</w:t>
-      </w:r>
-    </w:p>
-    <w:p>
-      <w:r>
-        <w:t>Concern over driver regulation is understandable but, in our view, not material. The new 8% commission cap applies to two-wheel rides (GoRide), which are only about 7% of group net revenue. The company has already cut its guidance for this by about Rp300bn, and it earns most of its profit elsewhere: payments and lending now earn more than Gojek, alongside food and parcel delivery and merchant services.</w:t>
-      </w:r>
-    </w:p>
-    <w:p>
-      <w:r>
-        <w:t>The main risks are that regulation extends to GoCar or GoFood, a softer second half, and continued volatility while the remaining sellers exit. We think forced, price-insensitive selling has pushed GOTO well below its fair value and that this is a good entry point.</w:t>
+        <w:t>Key risks are wider regulation and continued volatility. We believe forced selling has pushed GOTO well below fair value and see this as a good entry point.</w:t>
       </w:r>
     </w:p>
     <w:p>
@@ -46,7 +36,7 @@
           <w:i/>
           <w:sz w:val="17"/>
         </w:rPr>
-        <w:t>Sources: ULTJ disclosures via Bisnis Indonesia and CNBC Indonesia; GoTo 2Q26 results and earnings call; MSCI via Reuters; Mirae Asset; Kompas; Katadata. Prices as of 2 October 2026. Not investment advice.</w:t>
+        <w:t>Sources: ULTJ disclosures; GoTo 2Q26 results; MSCI; Kompas; Katadata. Prices as of 2 October 2026. Not investment advice.</w:t>
       </w:r>
     </w:p>
     <w:sectPr>

</xml_diff>

<commit_message>
Explain driver-regulation concern and why it is manageable in GOTO note
Co-Authored-By: Claude Opus 5.5 <noreply@anthropic.com>
Claude-Session: https://claude.ai/code/session_01U5zaKN8eSrW2AdoJ1d5V8T
</commit_message>
<xml_diff>
--- a/Investment_Note_2026-10-02_ULTJ_to_GOTO.docx
+++ b/Investment_Note_2026-10-02_ULTJ_to_GOTO.docx
@@ -22,12 +22,17 @@
     </w:p>
     <w:p>
       <w:r>
-        <w:t>The business keeps improving. In 2Q26 net revenue grew 31% to Rp5.7tn and net profit was Rp252bn, the second profitable quarter in a row. Management expects operating profit, before currency and Tokopedia valuation effects, to stay positive. Cash of Rp23.5tn covers about 73% of the Rp32tn market value. The 8% commission cap on drivers affects GoRide, only about 7% of revenue, and the company earns most of its profit elsewhere.</w:t>
+        <w:t>The business keeps improving. In 2Q26 net revenue grew 31% to Rp5.7tn and net profit was Rp252bn, the second profitable quarter in a row. Management expects operating profit, before currency and Tokopedia valuation effects, to stay positive. Cash of Rp23.5tn covers about 73% of the Rp32tn market value, before borrowings.</w:t>
       </w:r>
     </w:p>
     <w:p>
       <w:r>
-        <w:t>Key risks are wider regulation and continued volatility. We believe forced selling has pushed GOTO well below fair value and see this as a good entry point.</w:t>
+        <w:t>The market's main concern is government policy on Gojek drivers. From 1 July the commission on two-wheel rides (GoRide) was capped at 8%, and investors fear similar limits on GoCar or GoFood. We think the impact is manageable for three reasons. First, GoRide is only about 7% of group revenue. Second, the cost is already known: the company cut its full-year guidance by about Rp300bn to reflect the cap. Third, GOTO no longer depends on drivers for profit. Payments and lending (GoPay) now earn more than Gojek, and the company can adjust other fees and services to offset lower commissions.</w:t>
+      </w:r>
+    </w:p>
+    <w:p>
+      <w:r>
+        <w:t>The key risks are that the cap is extended to larger services and that the share price stays volatile while the remaining sellers exit. We believe forced selling has pushed GOTO well below fair value and see this as a good entry point.</w:t>
       </w:r>
     </w:p>
     <w:p>

</xml_diff>